<commit_message>
Leviticus 2nd re-audit: 2 MSG omissions restored (EN/KO), GDocs 27/27 verified
</commit_message>
<xml_diff>
--- a/gdocs_build/Leviticus.docx
+++ b/gdocs_build/Leviticus.docx
@@ -9239,7 +9239,7 @@
               <w:rPr>
                 <w:sz w:val="18"/>
               </w:rPr>
-              <w:t>“On the eighth day, he brings all this to the priest at the entrance of the Tent of Meeting in front of God. The priest will take the lamb for the Compensation-Offering and the oil and wave them before God. He’ll sacrifice the lamb, take some of its blood, and put it on the person’s right earlobe, right thumb, and right big toe. The priest will pour some oil into his left palm and sprinkle it seven times before God with his right finger. He’ll then put some of that oil from his palm on the same places he put the blood—the right earlobe, right thumb, and right big toe. The rest of the oil goes on the person’s head to make things right for them with God.</w:t>
+              <w:t>“On the eighth day, he brings all this to the priest at the entrance of the Tent of Meeting in front of God. The priest will take the lamb for the Compensation-Offering and a pint of oil and wave them before God as a Wave-Offering. He’ll sacrifice the lamb, take some of its blood, and put it on the person’s right earlobe, right thumb, and right big toe. The priest will pour some oil into his left palm and sprinkle it seven times before God with his right finger. He’ll then put some of that oil from his palm on the same places he put the blood—the right earlobe, right thumb, and right big toe. The rest of the oil goes on the person’s head to make things right for them with God.</w:t>
             </w:r>
           </w:p>
         </w:tc>
@@ -15342,7 +15342,7 @@
               <w:rPr>
                 <w:sz w:val="18"/>
               </w:rPr>
-              <w:t>'Don’t try to get revenge or hold a grudge.</w:t>
+              <w:t>'Don’t try to get revenge or hold a grudge against any of your people.</w:t>
             </w:r>
           </w:p>
         </w:tc>

</xml_diff>